<commit_message>
feat: add intro presentation link for industrial organization module to index page
</commit_message>
<xml_diff>
--- a/OI/00_lean_ss/Pense-bete_formation_organisation_industrielle.docx
+++ b/OI/00_lean_ss/Pense-bete_formation_organisation_industrielle.docx
@@ -1291,6 +1291,144 @@
           </w:p>
           <w:p>
             <w:pPr>
+              <w:spacing w:after="120"/>
+            </w:pPr>
+            <w:r>
+              <w:rPr>
+                <w:b/>
+                <w:bCs/>
+              </w:rPr>
+              <w:t xml:space="preserve">L'empreinte cachée (chiffres sourcés, voir liens en fin de fiche) :</w:t>
+            </w:r>
+          </w:p>
+          <w:p>
+            <w:pPr>
+              <w:pStyle w:val="ListParagraph"/>
+              <w:numPr>
+                <w:ilvl w:val="0"/>
+                <w:numId w:val="2"/>
+              </w:numPr>
+              <w:spacing w:after="60"/>
+            </w:pPr>
+            <w:r>
+              <w:rPr>
+                <w:b/>
+                <w:bCs/>
+              </w:rPr>
+              <w:t xml:space="preserve">Plus de 200 entreprises</w:t>
+            </w:r>
+            <w:r>
+              <w:t xml:space="preserve"> fournissent les composants d'un seul smartphone, avec des pièces venant d'environ </w:t>
+            </w:r>
+            <w:r>
+              <w:rPr>
+                <w:b/>
+                <w:bCs/>
+              </w:rPr>
+              <w:t xml:space="preserve">43 pays</w:t>
+            </w:r>
+            <w:r>
+              <w:t xml:space="preserve">.</w:t>
+            </w:r>
+          </w:p>
+          <w:p>
+            <w:pPr>
+              <w:pStyle w:val="ListParagraph"/>
+              <w:numPr>
+                <w:ilvl w:val="0"/>
+                <w:numId w:val="2"/>
+              </w:numPr>
+              <w:spacing w:after="60"/>
+            </w:pPr>
+            <w:r>
+              <w:rPr>
+                <w:b/>
+                <w:bCs/>
+              </w:rPr>
+              <w:t xml:space="preserve">Environ 237 kg de minerai</w:t>
+            </w:r>
+            <w:r>
+              <w:t xml:space="preserve"> extrait et traité pour obtenir les ~30 g de métaux du téléphone (source ADEME), soit un ratio d'environ 1 pour 7900.</w:t>
+            </w:r>
+          </w:p>
+          <w:p>
+            <w:pPr>
+              <w:pStyle w:val="ListParagraph"/>
+              <w:numPr>
+                <w:ilvl w:val="0"/>
+                <w:numId w:val="2"/>
+              </w:numPr>
+              <w:spacing w:after="60"/>
+            </w:pPr>
+            <w:r>
+              <w:t xml:space="preserve">Autre estimation : </w:t>
+            </w:r>
+            <w:r>
+              <w:rPr>
+                <w:b/>
+                <w:bCs/>
+              </w:rPr>
+              <w:t xml:space="preserve">près de 70 kg de matières premières</w:t>
+            </w:r>
+            <w:r>
+              <w:t xml:space="preserve"> mobilisées, dont environ 34 kg de minerai (méthode de comptage différente).</w:t>
+            </w:r>
+          </w:p>
+          <w:p>
+            <w:pPr>
+              <w:pStyle w:val="ListParagraph"/>
+              <w:numPr>
+                <w:ilvl w:val="0"/>
+                <w:numId w:val="2"/>
+              </w:numPr>
+              <w:spacing w:after="60"/>
+            </w:pPr>
+            <w:r>
+              <w:rPr>
+                <w:b/>
+                <w:bCs/>
+              </w:rPr>
+              <w:t xml:space="preserve">Environ 12 000 litres d'eau</w:t>
+            </w:r>
+            <w:r>
+              <w:t xml:space="preserve"> par smartphone (fourchette de 12 000 à 13 000 litres selon les sources).</w:t>
+            </w:r>
+          </w:p>
+          <w:p>
+            <w:pPr>
+              <w:pStyle w:val="ListParagraph"/>
+              <w:numPr>
+                <w:ilvl w:val="0"/>
+                <w:numId w:val="2"/>
+              </w:numPr>
+              <w:spacing w:after="60"/>
+            </w:pPr>
+            <w:r>
+              <w:t xml:space="preserve">La </w:t>
+            </w:r>
+            <w:r>
+              <w:rPr>
+                <w:b/>
+                <w:bCs/>
+              </w:rPr>
+              <w:t xml:space="preserve">fabrication</w:t>
+            </w:r>
+            <w:r>
+              <w:t xml:space="preserve"> pèse environ </w:t>
+            </w:r>
+            <w:r>
+              <w:rPr>
+                <w:b/>
+                <w:bCs/>
+              </w:rPr>
+              <w:t xml:space="preserve">les 3/4</w:t>
+            </w:r>
+            <w:r>
+              <w:t xml:space="preserve"> de l'empreinte totale du téléphone (ADEME) ; les composants parcourent l'équivalent de plusieurs tours du monde.</w:t>
+            </w:r>
+          </w:p>
+          <w:p>
+            <w:pPr>
               <w:spacing w:after="0"/>
             </w:pPr>
             <w:r>
@@ -1301,7 +1439,7 @@
               <w:t xml:space="preserve">À retenir : </w:t>
             </w:r>
             <w:r>
-              <w:t xml:space="preserve">un objet du quotidien mobilise des dizaines de mines, d'usines et de transports sur toute la planète. Et il faudra le recycler.</w:t>
+              <w:t xml:space="preserve">un objet du quotidien mobilise des centaines d'entreprises, des dizaines de mines et des milliers de litres d'eau. D'où l'intérêt de le garder longtemps et de le recycler.</w:t>
             </w:r>
           </w:p>
         </w:tc>
@@ -3522,7 +3660,7 @@
         </w:rPr>
         <w:t xml:space="preserve">Crayon, I, Pencil (Leonard Read, 1958) : </w:t>
       </w:r>
-      <w:hyperlink w:history="1" r:id="rIdv_6oj7byi8wp_a6cnorqz">
+      <w:hyperlink w:history="1" r:id="rIdt5d9oqlhqp40q8_lv7eb8">
         <w:r>
           <w:rPr>
             <w:rStyle w:val="Hyperlink"/>
@@ -3545,7 +3683,7 @@
         </w:rPr>
         <w:t xml:space="preserve">Crayon, l'analogie expliquee par Milton Friedman : </w:t>
       </w:r>
-      <w:hyperlink w:history="1" r:id="rIdj99jh2plg6uh9cy9b6iov">
+      <w:hyperlink w:history="1" r:id="rIdmwdwewdzaa3peaatl7hd_">
         <w:r>
           <w:rPr>
             <w:rStyle w:val="Hyperlink"/>
@@ -3568,7 +3706,7 @@
         </w:rPr>
         <w:t xml:space="preserve">Smartphone, metaux critiques (MINING.COM) : </w:t>
       </w:r>
-      <w:hyperlink w:history="1" r:id="rIdxsviatl_6yq63ladt_kxq">
+      <w:hyperlink w:history="1" r:id="rIdvpd64us_l1r00rjqbzmwd">
         <w:r>
           <w:rPr>
             <w:rStyle w:val="Hyperlink"/>
@@ -3591,7 +3729,7 @@
         </w:rPr>
         <w:t xml:space="preserve">Smartphone, quantites or cuivre etc (Chemistry World) : </w:t>
       </w:r>
-      <w:hyperlink w:history="1" r:id="rIdkfmwwakyvd0bpcmmyy71o">
+      <w:hyperlink w:history="1" r:id="rIdz2qeck8ffha_wtwyfgj4q">
         <w:r>
           <w:rPr>
             <w:rStyle w:val="Hyperlink"/>
@@ -3612,9 +3750,78 @@
           <w:sz w:val="16"/>
           <w:szCs w:val="16"/>
         </w:rPr>
+        <w:t xml:space="preserve">Smartphone, empreinte cachee 237 kg de minerai et eau (ADEME via actu-environnement) : </w:t>
+      </w:r>
+      <w:hyperlink w:history="1" r:id="rIdga1jxmtw6z0uwh59wj13x">
+        <w:r>
+          <w:rPr>
+            <w:rStyle w:val="Hyperlink"/>
+            <w:sz w:val="16"/>
+            <w:szCs w:val="16"/>
+          </w:rPr>
+          <w:t xml:space="preserve">https://www.actu-environnement.com/media/pdf/news-29628-empreinte-cachee-smartphone.pdf</w:t>
+        </w:r>
+      </w:hyperlink>
+    </w:p>
+    <w:p>
+      <w:pPr>
+        <w:spacing w:after="30"/>
+      </w:pPr>
+      <w:r>
+        <w:rPr>
+          <w:color w:val="555555"/>
+          <w:sz w:val="16"/>
+          <w:szCs w:val="16"/>
+        </w:rPr>
+        <w:t xml:space="preserve">Smartphone, plus de 200 fournisseurs et 43 pays (Apple supply chain) : </w:t>
+      </w:r>
+      <w:hyperlink w:history="1" r:id="rIdfvgypfrodjt-besfntkq1">
+        <w:r>
+          <w:rPr>
+            <w:rStyle w:val="Hyperlink"/>
+            <w:sz w:val="16"/>
+            <w:szCs w:val="16"/>
+          </w:rPr>
+          <w:t xml:space="preserve">https://en.wikipedia.org/wiki/Apple_supply_chain</w:t>
+        </w:r>
+      </w:hyperlink>
+    </w:p>
+    <w:p>
+      <w:pPr>
+        <w:spacing w:after="30"/>
+      </w:pPr>
+      <w:r>
+        <w:rPr>
+          <w:color w:val="555555"/>
+          <w:sz w:val="16"/>
+          <w:szCs w:val="16"/>
+        </w:rPr>
+        <w:t xml:space="preserve">Smartphone, 70 kg de matieres et 13000 L d'eau (Compare and Recycle) : </w:t>
+      </w:r>
+      <w:hyperlink w:history="1" r:id="rIdpcqrvt1q8ghk9nppbkh6n">
+        <w:r>
+          <w:rPr>
+            <w:rStyle w:val="Hyperlink"/>
+            <w:sz w:val="16"/>
+            <w:szCs w:val="16"/>
+          </w:rPr>
+          <w:t xml:space="preserve">https://www.compareandrecycle.co.uk/blog/whats-inside-my-phone</w:t>
+        </w:r>
+      </w:hyperlink>
+    </w:p>
+    <w:p>
+      <w:pPr>
+        <w:spacing w:after="30"/>
+      </w:pPr>
+      <w:r>
+        <w:rPr>
+          <w:color w:val="555555"/>
+          <w:sz w:val="16"/>
+          <w:szCs w:val="16"/>
+        </w:rPr>
         <w:t xml:space="preserve">Adam Smith, le manteau de laine (Stanford) : </w:t>
       </w:r>
-      <w:hyperlink w:history="1" r:id="rIdug7bn3lglu77yyrkedw42">
+      <w:hyperlink w:history="1" r:id="rId-dmvbpf2s8fitzga3n93x">
         <w:r>
           <w:rPr>
             <w:rStyle w:val="Hyperlink"/>
@@ -3663,7 +3870,7 @@
         </w:rPr>
         <w:t xml:space="preserve">Volume de donnees mondial (Statista) : </w:t>
       </w:r>
-      <w:hyperlink w:history="1" r:id="rIdxjnvegtd103gtuppxsfcd">
+      <w:hyperlink w:history="1" r:id="rIdpv7des8wcihtpx1-5f8y7">
         <w:r>
           <w:rPr>
             <w:rStyle w:val="Hyperlink"/>

</xml_diff>